<commit_message>
Format report to single spacing for two-page length
Co-Authored-By: Claude Sonnet 4.6 <noreply@anthropic.com>
</commit_message>
<xml_diff>
--- a/He_Raymond_Cotiviti_Report.docx
+++ b/He_Raymond_Cotiviti_Report.docx
@@ -79,19 +79,7 @@
     </w:p>
     <w:p>
       <w:pPr>
-        <w:spacing w:after="0" w:before="0" w:line="240" w:lineRule="auto"/>
-        <w:jc w:val="left"/>
-        <w:rPr/>
-      </w:pPr>
-      <w:r>
-        <w:rPr>
-          <w:rtl w:val="0"/>
-        </w:rPr>
-      </w:r>
-    </w:p>
-    <w:p>
-      <w:pPr>
-        <w:spacing w:after="0" w:before="0" w:line="480" w:lineRule="auto"/>
+        <w:spacing w:after="0" w:before="0" w:line="360" w:lineRule="auto"/>
         <w:jc w:val="center"/>
         <w:rPr>
           <w:sz w:val="32"/>
@@ -140,7 +128,7 @@
     </w:p>
     <w:p>
       <w:pPr>
-        <w:spacing w:after="0" w:before="0" w:line="480" w:lineRule="auto"/>
+        <w:spacing w:after="0" w:before="0" w:line="240" w:lineRule="auto"/>
         <w:ind w:firstLine="720"/>
         <w:jc w:val="left"/>
         <w:rPr/>
@@ -250,7 +238,7 @@
     </w:p>
     <w:p>
       <w:pPr>
-        <w:spacing w:after="0" w:before="0" w:line="480" w:lineRule="auto"/>
+        <w:spacing w:after="0" w:before="0" w:line="240" w:lineRule="auto"/>
         <w:ind w:firstLine="720"/>
         <w:jc w:val="left"/>
         <w:rPr/>
@@ -378,7 +366,7 @@
     </w:p>
     <w:p>
       <w:pPr>
-        <w:spacing w:after="0" w:before="0" w:line="480" w:lineRule="auto"/>
+        <w:spacing w:after="0" w:before="0" w:line="240" w:lineRule="auto"/>
         <w:ind w:firstLine="720"/>
         <w:jc w:val="left"/>
         <w:rPr/>
@@ -455,7 +443,7 @@
     </w:p>
     <w:p>
       <w:pPr>
-        <w:spacing w:after="0" w:before="0" w:line="480" w:lineRule="auto"/>
+        <w:spacing w:after="0" w:before="0" w:line="240" w:lineRule="auto"/>
         <w:ind w:firstLine="720"/>
         <w:jc w:val="left"/>
         <w:rPr/>
@@ -548,7 +536,7 @@
     </w:p>
     <w:p>
       <w:pPr>
-        <w:spacing w:after="0" w:before="0" w:line="480" w:lineRule="auto"/>
+        <w:spacing w:after="0" w:before="0" w:line="240" w:lineRule="auto"/>
         <w:ind w:firstLine="720"/>
         <w:jc w:val="left"/>
         <w:rPr/>
@@ -626,8 +614,15 @@
         <w:rPr/>
       </w:pPr>
       <w:r>
-        <w:br w:type="page"/>
+        <w:rPr>
+          <w:rtl w:val="0"/>
+        </w:rPr>
       </w:r>
+    </w:p>
+    <w:p>
+      <w:pPr>
+        <w:rPr/>
+      </w:pPr>
       <w:r>
         <w:rPr>
           <w:rtl w:val="0"/>

</xml_diff>